<commit_message>
docs: cập nhật bản báo cáo nhóm 3 vừa lưu
</commit_message>
<xml_diff>
--- a/BaoCao/Bao_cao_Nhom3 _Quan_ly_nha_hang.docx
+++ b/BaoCao/Bao_cao_Nhom3 _Quan_ly_nha_hang.docx
@@ -995,6 +995,13 @@
     </w:p>
     <w:sdt>
       <w:sdtPr>
+        <w:rPr>
+          <w:b w:val="0"/>
+          <w:bCs w:val="0"/>
+          <w:caps w:val="0"/>
+          <w:sz w:val="26"/>
+          <w:szCs w:val="26"/>
+        </w:rPr>
         <w:id w:val="-697702138"/>
         <w:docPartObj>
           <w:docPartGallery w:val="Table of Contents"/>
@@ -1003,10 +1010,7 @@
       </w:sdtPr>
       <w:sdtEndPr>
         <w:rPr>
-          <w:caps w:val="0"/>
           <w:noProof/>
-          <w:sz w:val="26"/>
-          <w:szCs w:val="26"/>
         </w:rPr>
       </w:sdtEndPr>
       <w:sdtContent>
@@ -4910,6 +4914,63 @@
         <w:t xml:space="preserve"> để hiển thị giao diện hoặc chuyển hướng người dùng.</w:t>
       </w:r>
     </w:p>
+    <w:p>
+      <w:pPr>
+        <w:pStyle w:val="Heading2"/>
+      </w:pPr>
+      <w:r>
+        <w:t xml:space="preserve">Phân công </w:t>
+      </w:r>
+      <w:proofErr w:type="spellStart"/>
+      <w:r>
+        <w:t>công</w:t>
+      </w:r>
+      <w:proofErr w:type="spellEnd"/>
+      <w:r>
+        <w:t xml:space="preserve"> việc</w:t>
+      </w:r>
+    </w:p>
+    <w:p>
+      <w:pPr>
+        <w:spacing w:after="60"/>
+      </w:pPr>
+      <w:r>
+        <w:t>Nguyễn Vũ Khánh</w:t>
+      </w:r>
+      <w:r>
+        <w:t xml:space="preserve"> : </w:t>
+      </w:r>
+    </w:p>
+    <w:p>
+      <w:pPr>
+        <w:spacing w:after="60"/>
+      </w:pPr>
+      <w:r>
+        <w:lastRenderedPageBreak/>
+        <w:t>Vi Thái Học</w:t>
+      </w:r>
+    </w:p>
+    <w:p>
+      <w:pPr>
+        <w:spacing w:after="60"/>
+      </w:pPr>
+      <w:r>
+        <w:t>Trần Đắc Gia Bảo</w:t>
+      </w:r>
+    </w:p>
+    <w:p>
+      <w:pPr>
+        <w:spacing w:after="60"/>
+      </w:pPr>
+      <w:r>
+        <w:t>Phạm Đức Thành</w:t>
+      </w:r>
+    </w:p>
+    <w:p>
+      <w:r>
+        <w:t>Trương Doãn An</w:t>
+      </w:r>
+    </w:p>
     <w:p/>
     <w:p>
       <w:pPr>
@@ -20488,10 +20549,7 @@
         <w:t>MODULE 3</w:t>
       </w:r>
       <w:r>
-        <w:t xml:space="preserve"> </w:t>
-      </w:r>
-      <w:r>
-        <w:t>QUẢN LÝ MÓN ĂN, KHÁCH HÀNG VÀ ĐẶT BÀN</w:t>
+        <w:t xml:space="preserve"> QUẢN LÝ MÓN ĂN, KHÁCH HÀNG VÀ ĐẶT BÀN</w:t>
       </w:r>
       <w:bookmarkEnd w:id="29"/>
     </w:p>
@@ -31648,7 +31706,7 @@
   <w:style w:type="paragraph" w:default="1" w:styleId="Normal">
     <w:name w:val="Normal"/>
     <w:qFormat/>
-    <w:rsid w:val="00FC693F"/>
+    <w:rsid w:val="00F01CBA"/>
     <w:pPr>
       <w:spacing w:after="160" w:line="278" w:lineRule="auto"/>
     </w:pPr>
@@ -31850,6 +31908,7 @@
   <w:style w:type="character" w:default="1" w:styleId="DefaultParagraphFont">
     <w:name w:val="Default Paragraph Font"/>
     <w:uiPriority w:val="1"/>
+    <w:semiHidden/>
     <w:unhideWhenUsed/>
   </w:style>
   <w:style w:type="table" w:default="1" w:styleId="TableNormal">

</xml_diff>